<commit_message>
Reference-doc: APA heading hierarchy + page numbers in header
- Heading 1: bold, centred; Heading 2: bold, flush left; Heading 3: italic
  (not bold), flush left.
- Page number moved from a centred footer to a right-aligned header.

Co-Authored-By: Claude Sonnet 5 <noreply@anthropic.com>
Claude-Session: https://claude.ai/code/session_018J5mhVKvQuRYePTVBPdwzv
</commit_message>
<xml_diff>
--- a/manuscript/R&R/reference-doc.docx
+++ b/manuscript/R&R/reference-doc.docx
@@ -314,7 +314,7 @@
       </w:r>
     </w:p>
     <w:sectPr>
-      <w:footerReference w:type="default" r:id="rId9"/>
+      <w:headerReference w:type="default" r:id="rId9"/>
       <w:footnotePr>
         <w:numRestart w:val="eachSect"/>
       </w:footnotePr>
@@ -328,12 +328,55 @@
 <w:comments xmlns:w="http://schemas.openxmlformats.org/wordprocessingml/2006/main" xmlns:m="http://schemas.openxmlformats.org/officeDocument/2006/math" xmlns:r="http://schemas.openxmlformats.org/officeDocument/2006/relationships" xmlns:o="urn:schemas-microsoft-com:office:office" xmlns:v="urn:schemas-microsoft-com:vml" xmlns:w10="urn:schemas-microsoft-com:office:word" xmlns:a="http://schemas.openxmlformats.org/drawingml/2006/main" xmlns:pic="http://schemas.openxmlformats.org/drawingml/2006/picture" xmlns:wp="http://schemas.openxmlformats.org/drawingml/2006/wordprocessingDrawing"/>
 </file>
 
-<file path=word/footer1.xml><?xml version="1.0" encoding="utf-8"?>
-<w:ftr xmlns:m="http://schemas.openxmlformats.org/officeDocument/2006/math" xmlns:mc="http://schemas.openxmlformats.org/markup-compatibility/2006" xmlns:mo="http://schemas.microsoft.com/office/mac/office/2008/main" xmlns:mv="urn:schemas-microsoft-com:mac:vml" xmlns:o="urn:schemas-microsoft-com:office:office" xmlns:r="http://schemas.openxmlformats.org/officeDocument/2006/relationships" xmlns:v="urn:schemas-microsoft-com:vml" xmlns:w10="urn:schemas-microsoft-com:office:word" xmlns:w14="http://schemas.microsoft.com/office/word/2010/wordml" xmlns:w="http://schemas.openxmlformats.org/wordprocessingml/2006/main" xmlns:wne="http://schemas.microsoft.com/office/word/2006/wordml" xmlns:wp14="http://schemas.microsoft.com/office/word/2010/wordprocessingDrawing" xmlns:wp="http://schemas.openxmlformats.org/drawingml/2006/wordprocessingDrawing" xmlns:wpc="http://schemas.microsoft.com/office/word/2010/wordprocessingCanvas" xmlns:wpg="http://schemas.microsoft.com/office/word/2010/wordprocessingGroup" xmlns:wpi="http://schemas.microsoft.com/office/word/2010/wordprocessingInk" xmlns:wps="http://schemas.microsoft.com/office/word/2010/wordprocessingShape" mc:Ignorable="w14 wp14">
+<file path=word/footnotes.xml><?xml version="1.0" encoding="utf-8"?>
+<w:footnotes xmlns:w="http://schemas.openxmlformats.org/wordprocessingml/2006/main" xmlns:m="http://schemas.openxmlformats.org/officeDocument/2006/math" xmlns:r="http://schemas.openxmlformats.org/officeDocument/2006/relationships" xmlns:o="urn:schemas-microsoft-com:office:office" xmlns:v="urn:schemas-microsoft-com:vml" xmlns:w10="urn:schemas-microsoft-com:office:word" xmlns:a="http://schemas.openxmlformats.org/drawingml/2006/main" xmlns:pic="http://schemas.openxmlformats.org/drawingml/2006/picture" xmlns:wp="http://schemas.openxmlformats.org/drawingml/2006/wordprocessingDrawing">
+  <w:footnote w:type="continuationSeparator" w:id="0">
+    <w:p>
+      <w:r>
+        <w:continuationSeparator/>
+      </w:r>
+    </w:p>
+  </w:footnote>
+  <w:footnote w:type="separator" w:id="-1">
+    <w:p>
+      <w:r>
+        <w:separator/>
+      </w:r>
+    </w:p>
+  </w:footnote>
+  <w:footnote w:id="31">
+    <w:p>
+      <w:pPr>
+        <w:pStyle w:val="FootnoteText"/>
+      </w:pPr>
+      <w:r>
+        <w:rPr>
+          <w:rStyle w:val="FootnoteReference"/>
+        </w:rPr>
+        <w:footnoteRef/>
+      </w:r>
+      <w:r>
+        <w:t>Footnote Text.</w:t>
+      </w:r>
+    </w:p>
+    <w:p>
+      <w:pPr>
+        <w:pStyle w:val="FootnoteBlockText"/>
+      </w:pPr>
+      <w:r>
+        <w:t>Footnote Block Text</w:t>
+      </w:r>
+    </w:p>
+  </w:footnote>
+</w:footnotes>
+</file>
+
+<file path=word/header1.xml><?xml version="1.0" encoding="utf-8"?>
+<w:hdr xmlns:m="http://schemas.openxmlformats.org/officeDocument/2006/math" xmlns:mc="http://schemas.openxmlformats.org/markup-compatibility/2006" xmlns:mo="http://schemas.microsoft.com/office/mac/office/2008/main" xmlns:mv="urn:schemas-microsoft-com:mac:vml" xmlns:o="urn:schemas-microsoft-com:office:office" xmlns:r="http://schemas.openxmlformats.org/officeDocument/2006/relationships" xmlns:v="urn:schemas-microsoft-com:vml" xmlns:w10="urn:schemas-microsoft-com:office:word" xmlns:w14="http://schemas.microsoft.com/office/word/2010/wordml" xmlns:w="http://schemas.openxmlformats.org/wordprocessingml/2006/main" xmlns:wne="http://schemas.microsoft.com/office/word/2006/wordml" xmlns:wp14="http://schemas.microsoft.com/office/word/2010/wordprocessingDrawing" xmlns:wp="http://schemas.openxmlformats.org/drawingml/2006/wordprocessingDrawing" xmlns:wpc="http://schemas.microsoft.com/office/word/2010/wordprocessingCanvas" xmlns:wpg="http://schemas.microsoft.com/office/word/2010/wordprocessingGroup" xmlns:wpi="http://schemas.microsoft.com/office/word/2010/wordprocessingInk" xmlns:wps="http://schemas.microsoft.com/office/word/2010/wordprocessingShape" mc:Ignorable="w14 wp14">
   <w:p>
     <w:pPr>
-      <w:pStyle w:val="Footer"/>
-      <w:jc w:val="center"/>
+      <w:pStyle w:val="Header"/>
+      <w:jc w:val="right"/>
     </w:pPr>
     <w:r/>
     <w:r>
@@ -347,50 +390,7 @@
       <w:fldChar w:fldCharType="end"/>
     </w:r>
   </w:p>
-</w:ftr>
-</file>
-
-<file path=word/footnotes.xml><?xml version="1.0" encoding="utf-8"?>
-<w:footnotes xmlns:w="http://schemas.openxmlformats.org/wordprocessingml/2006/main" xmlns:m="http://schemas.openxmlformats.org/officeDocument/2006/math" xmlns:r="http://schemas.openxmlformats.org/officeDocument/2006/relationships" xmlns:o="urn:schemas-microsoft-com:office:office" xmlns:v="urn:schemas-microsoft-com:vml" xmlns:w10="urn:schemas-microsoft-com:office:word" xmlns:a="http://schemas.openxmlformats.org/drawingml/2006/main" xmlns:pic="http://schemas.openxmlformats.org/drawingml/2006/picture" xmlns:wp="http://schemas.openxmlformats.org/drawingml/2006/wordprocessingDrawing">
-  <w:footnote w:type="continuationSeparator" w:id="0">
-    <w:p>
-      <w:r>
-        <w:continuationSeparator/>
-      </w:r>
-    </w:p>
-  </w:footnote>
-  <w:footnote w:type="separator" w:id="-1">
-    <w:p>
-      <w:r>
-        <w:separator/>
-      </w:r>
-    </w:p>
-  </w:footnote>
-  <w:footnote w:id="31">
-    <w:p>
-      <w:pPr>
-        <w:pStyle w:val="FootnoteText"/>
-      </w:pPr>
-      <w:r>
-        <w:rPr>
-          <w:rStyle w:val="FootnoteReference"/>
-        </w:rPr>
-        <w:footnoteRef/>
-      </w:r>
-      <w:r>
-        <w:t>Footnote Text.</w:t>
-      </w:r>
-    </w:p>
-    <w:p>
-      <w:pPr>
-        <w:pStyle w:val="FootnoteBlockText"/>
-      </w:pPr>
-      <w:r>
-        <w:t>Footnote Block Text</w:t>
-      </w:r>
-    </w:p>
-  </w:footnote>
-</w:footnotes>
+</w:hdr>
 </file>
 
 <file path=word/numbering.xml><?xml version="1.0" encoding="utf-8"?>
@@ -731,11 +731,13 @@
       <w:keepNext/>
       <w:keepLines/>
       <w:spacing w:before="360" w:after="80" w:line="240" w:lineRule="auto"/>
+      <w:jc w:val="center"/>
       <w:outlineLvl w:val="0"/>
     </w:pPr>
     <w:rPr>
       <w:rFonts w:ascii="Times New Roman" w:hAnsi="Times New Roman" w:eastAsia="Times New Roman" w:cs="Times New Roman"/>
       <w:b/>
+      <w:i w:val="0"/>
       <w:color w:val="000000"/>
       <w:sz w:val="24"/>
       <w:szCs w:val="40"/>
@@ -755,11 +757,13 @@
       <w:keepNext/>
       <w:keepLines/>
       <w:spacing w:before="160" w:after="80" w:line="240" w:lineRule="auto"/>
+      <w:jc w:val="left"/>
       <w:outlineLvl w:val="1"/>
     </w:pPr>
     <w:rPr>
       <w:rFonts w:ascii="Times New Roman" w:hAnsi="Times New Roman" w:eastAsia="Times New Roman" w:cs="Times New Roman"/>
       <w:b/>
+      <w:i w:val="0"/>
       <w:color w:val="000000"/>
       <w:sz w:val="24"/>
       <w:szCs w:val="32"/>
@@ -779,11 +783,13 @@
       <w:keepNext/>
       <w:keepLines/>
       <w:spacing w:before="160" w:after="80" w:line="240" w:lineRule="auto"/>
+      <w:jc w:val="left"/>
       <w:outlineLvl w:val="2"/>
     </w:pPr>
     <w:rPr>
       <w:rFonts w:ascii="Times New Roman" w:hAnsi="Times New Roman" w:eastAsia="Times New Roman" w:cs="Times New Roman"/>
-      <w:b/>
+      <w:b w:val="0"/>
+      <w:i/>
       <w:color w:val="000000"/>
       <w:sz w:val="24"/>
       <w:szCs w:val="28"/>

</xml_diff>